<commit_message>
Sesión 4: devolución de la Práctica 2 y entrega por integrante
</commit_message>
<xml_diff>
--- a/sesion4/archivos/Hoja_taller_sesion4_EST323.docx
+++ b/sesion4/archivos/Hoja_taller_sesion4_EST323.docx
@@ -1340,7 +1340,13 @@
         <w:rPr>
           <w:sz w:val="19"/>
         </w:rPr>
-        <w:t>☐  Los cinco objetos tienen atributos, y los atributos tienen valores posibles.</w:t>
+        <w:t>☐</w:t>
+      </w:r>
+      <w:r>
+        <w:rPr>
+          <w:sz w:val="19"/>
+        </w:rPr>
+        <w:t xml:space="preserve">  Los cinco objetos tienen atributos, y los atributos tienen valores posibles.</w:t>
       </w:r>
     </w:p>
     <w:p>
@@ -1348,7 +1354,13 @@
         <w:rPr>
           <w:sz w:val="19"/>
         </w:rPr>
-        <w:t>☐  El caso de uso describe una intención, no una pantalla ni un botón.</w:t>
+        <w:t>☐</w:t>
+      </w:r>
+      <w:r>
+        <w:rPr>
+          <w:sz w:val="19"/>
+        </w:rPr>
+        <w:t xml:space="preserve">  El caso de uso describe una intención, no una pantalla ni un botón.</w:t>
       </w:r>
     </w:p>
     <w:p>
@@ -1356,7 +1368,13 @@
         <w:rPr>
           <w:sz w:val="19"/>
         </w:rPr>
-        <w:t>☐  Cada operación dice qué cambia. Si no cambia nada y no devuelve nada, sobra.</w:t>
+        <w:t>☐</w:t>
+      </w:r>
+      <w:r>
+        <w:rPr>
+          <w:sz w:val="19"/>
+        </w:rPr>
+        <w:t xml:space="preserve">  Cada operación dice qué cambia. Si no cambia nada y no devuelve nada, sobra.</w:t>
       </w:r>
     </w:p>
     <w:p>
@@ -1364,7 +1382,13 @@
         <w:rPr>
           <w:sz w:val="19"/>
         </w:rPr>
-        <w:t>☐  La configuración son límites impuestos, no tecnologías elegidas por gusto.</w:t>
+        <w:t>☐</w:t>
+      </w:r>
+      <w:r>
+        <w:rPr>
+          <w:sz w:val="19"/>
+        </w:rPr>
+        <w:t xml:space="preserve">  La configuración son límites impuestos, no tecnologías elegidas por gusto.</w:t>
       </w:r>
     </w:p>
     <w:p>
@@ -1372,7 +1396,13 @@
         <w:rPr>
           <w:sz w:val="19"/>
         </w:rPr>
-        <w:t>☐  Están los cuatro modelos, cada uno con su título. No uno con anexos.</w:t>
+        <w:t>☐</w:t>
+      </w:r>
+      <w:r>
+        <w:rPr>
+          <w:sz w:val="19"/>
+        </w:rPr>
+        <w:t xml:space="preserve">  Están los cuatro modelos, cada uno con su título. No uno con anexos.</w:t>
       </w:r>
     </w:p>
     <w:p/>
@@ -1568,31 +1598,31 @@
       </w:rPr>
     </w:lvl>
   </w:abstractNum>
-  <w:num w:numId="1" w16cid:durableId="1355881682">
+  <w:num w:numId="1" w16cid:durableId="1669943915">
     <w:abstractNumId w:val="8"/>
   </w:num>
-  <w:num w:numId="2" w16cid:durableId="2098868301">
+  <w:num w:numId="2" w16cid:durableId="1382899889">
     <w:abstractNumId w:val="6"/>
   </w:num>
-  <w:num w:numId="3" w16cid:durableId="1657415548">
+  <w:num w:numId="3" w16cid:durableId="335231233">
     <w:abstractNumId w:val="5"/>
   </w:num>
-  <w:num w:numId="4" w16cid:durableId="1703900925">
+  <w:num w:numId="4" w16cid:durableId="1203713577">
     <w:abstractNumId w:val="4"/>
   </w:num>
-  <w:num w:numId="5" w16cid:durableId="1961066346">
+  <w:num w:numId="5" w16cid:durableId="309403052">
     <w:abstractNumId w:val="7"/>
   </w:num>
-  <w:num w:numId="6" w16cid:durableId="16002941">
+  <w:num w:numId="6" w16cid:durableId="750545507">
     <w:abstractNumId w:val="3"/>
   </w:num>
-  <w:num w:numId="7" w16cid:durableId="1153528437">
+  <w:num w:numId="7" w16cid:durableId="1499232177">
     <w:abstractNumId w:val="2"/>
   </w:num>
-  <w:num w:numId="8" w16cid:durableId="1268465882">
+  <w:num w:numId="8" w16cid:durableId="1468281755">
     <w:abstractNumId w:val="1"/>
   </w:num>
-  <w:num w:numId="9" w16cid:durableId="553780532">
+  <w:num w:numId="9" w16cid:durableId="9645288">
     <w:abstractNumId w:val="0"/>
   </w:num>
 </w:numbering>

</xml_diff>